<commit_message>
Fix: Fully populate Pertemuan 2-5 docx tables
</commit_message>
<xml_diff>
--- a/lesson-plans/lessonplan_pertemuan02.docx
+++ b/lesson-plans/lessonplan_pertemuan02.docx
@@ -179,28 +179,9 @@
             <w:vAlign w:val="center"/>
           </w:tcPr>
           <w:p>
-            <w:pPr>
-              <w:spacing w:before="60" w:after="60"/>
-              <w:rPr>
-                <w:rFonts w:ascii="Tahoma" w:eastAsia="Tahoma" w:hAnsi="Tahoma" w:cs="Tahoma"/>
-                <w:b/>
-                <w:sz w:val="22"/>
-                <w:szCs w:val="22"/>
-                <w:lang w:val="en-US"/>
-              </w:rPr>
-            </w:pPr>
-            <w:proofErr w:type="spellStart"/>
-            <w:r>
-              <w:rPr>
-                <w:rFonts w:ascii="Tahoma" w:eastAsia="Tahoma" w:hAnsi="Tahoma" w:cs="Tahoma"/>
-                <w:b/>
-                <w:sz w:val="22"/>
-                <w:szCs w:val="22"/>
-                <w:lang w:val="en-US"/>
-              </w:rPr>
+            <w:r>
               <w:t>Kejuruan</w:t>
             </w:r>
-            <w:proofErr w:type="spellEnd"/>
           </w:p>
         </w:tc>
         <w:tc>
@@ -208,6 +189,40 @@
             <w:tcW w:w="283" w:type="dxa"/>
             <w:tcBorders>
               <w:left w:val="nil"/>
+              <w:right w:val="nil"/>
+            </w:tcBorders>
+            <w:vAlign w:val="center"/>
+          </w:tcPr>
+          <w:p>
+            <w:r>
+              <w:t>:</w:t>
+            </w:r>
+          </w:p>
+        </w:tc>
+        <w:tc>
+          <w:tcPr>
+            <w:tcW w:w="2385" w:type="dxa"/>
+            <w:gridSpan w:val="3"/>
+            <w:tcBorders>
+              <w:left w:val="nil"/>
+            </w:tcBorders>
+            <w:vAlign w:val="center"/>
+          </w:tcPr>
+          <w:p>
+            <w:r>
+              <w:t>Teknologi Informasi dan Komunikasi (TIK)</w:t>
+            </w:r>
+          </w:p>
+        </w:tc>
+      </w:tr>
+      <w:tr>
+        <w:trPr>
+          <w:trHeight w:val="278"/>
+        </w:trPr>
+        <w:tc>
+          <w:tcPr>
+            <w:tcW w:w="1962" w:type="dxa"/>
+            <w:tcBorders>
               <w:right w:val="nil"/>
             </w:tcBorders>
             <w:vAlign w:val="center"/>
@@ -229,34 +244,15 @@
                 <w:sz w:val="22"/>
                 <w:szCs w:val="22"/>
               </w:rPr>
-              <w:t>:</w:t>
-            </w:r>
-          </w:p>
-        </w:tc>
-        <w:tc>
-          <w:tcPr>
-            <w:tcW w:w="2385" w:type="dxa"/>
-            <w:gridSpan w:val="3"/>
+              <w:t>Kode Unit Kompetensi</w:t>
+            </w:r>
+          </w:p>
+        </w:tc>
+        <w:tc>
+          <w:tcPr>
+            <w:tcW w:w="296" w:type="dxa"/>
             <w:tcBorders>
               <w:left w:val="nil"/>
-            </w:tcBorders>
-            <w:vAlign w:val="center"/>
-          </w:tcPr>
-          <w:p>
-            <w:r>
-              <w:t>TIK</w:t>
-            </w:r>
-          </w:p>
-        </w:tc>
-      </w:tr>
-      <w:tr>
-        <w:trPr>
-          <w:trHeight w:val="278"/>
-        </w:trPr>
-        <w:tc>
-          <w:tcPr>
-            <w:tcW w:w="1962" w:type="dxa"/>
-            <w:tcBorders>
               <w:right w:val="nil"/>
             </w:tcBorders>
             <w:vAlign w:val="center"/>
@@ -278,15 +274,79 @@
                 <w:sz w:val="22"/>
                 <w:szCs w:val="22"/>
               </w:rPr>
-              <w:t>Kode Unit Kompetensi</w:t>
-            </w:r>
-          </w:p>
-        </w:tc>
-        <w:tc>
-          <w:tcPr>
-            <w:tcW w:w="296" w:type="dxa"/>
+              <w:t>:</w:t>
+            </w:r>
+          </w:p>
+        </w:tc>
+        <w:tc>
+          <w:tcPr>
+            <w:tcW w:w="2994" w:type="dxa"/>
+            <w:gridSpan w:val="2"/>
             <w:tcBorders>
               <w:left w:val="nil"/>
+            </w:tcBorders>
+            <w:vAlign w:val="center"/>
+          </w:tcPr>
+          <w:p>
+            <w:r>
+              <w:t>M.74DKV13.012.2</w:t>
+            </w:r>
+          </w:p>
+        </w:tc>
+        <w:tc>
+          <w:tcPr>
+            <w:tcW w:w="1944" w:type="dxa"/>
+            <w:gridSpan w:val="2"/>
+            <w:tcBorders>
+              <w:right w:val="nil"/>
+            </w:tcBorders>
+            <w:vAlign w:val="center"/>
+          </w:tcPr>
+          <w:p>
+            <w:r>
+              <w:t>Penyajian ke</w:t>
+            </w:r>
+          </w:p>
+        </w:tc>
+        <w:tc>
+          <w:tcPr>
+            <w:tcW w:w="283" w:type="dxa"/>
+            <w:tcBorders>
+              <w:left w:val="nil"/>
+              <w:right w:val="nil"/>
+            </w:tcBorders>
+            <w:vAlign w:val="center"/>
+          </w:tcPr>
+          <w:p>
+            <w:r>
+              <w:t>:</w:t>
+            </w:r>
+          </w:p>
+        </w:tc>
+        <w:tc>
+          <w:tcPr>
+            <w:tcW w:w="2385" w:type="dxa"/>
+            <w:gridSpan w:val="3"/>
+            <w:tcBorders>
+              <w:left w:val="nil"/>
+            </w:tcBorders>
+            <w:vAlign w:val="center"/>
+          </w:tcPr>
+          <w:p>
+            <w:r>
+              <w:t>2</w:t>
+            </w:r>
+          </w:p>
+        </w:tc>
+      </w:tr>
+      <w:tr>
+        <w:trPr>
+          <w:trHeight w:val="60"/>
+        </w:trPr>
+        <w:tc>
+          <w:tcPr>
+            <w:tcW w:w="1962" w:type="dxa"/>
+            <w:tcBorders>
               <w:right w:val="nil"/>
             </w:tcBorders>
             <w:vAlign w:val="center"/>
@@ -308,30 +368,15 @@
                 <w:sz w:val="22"/>
                 <w:szCs w:val="22"/>
               </w:rPr>
-              <w:t>:</w:t>
-            </w:r>
-          </w:p>
-        </w:tc>
-        <w:tc>
-          <w:tcPr>
-            <w:tcW w:w="2994" w:type="dxa"/>
-            <w:gridSpan w:val="2"/>
+              <w:t>Judul Unit Kompetensi</w:t>
+            </w:r>
+          </w:p>
+        </w:tc>
+        <w:tc>
+          <w:tcPr>
+            <w:tcW w:w="296" w:type="dxa"/>
             <w:tcBorders>
               <w:left w:val="nil"/>
-            </w:tcBorders>
-            <w:vAlign w:val="center"/>
-          </w:tcPr>
-          <w:p>
-            <w:r>
-              <w:t>M.74DKV13.012.2</w:t>
-            </w:r>
-          </w:p>
-        </w:tc>
-        <w:tc>
-          <w:tcPr>
-            <w:tcW w:w="1944" w:type="dxa"/>
-            <w:gridSpan w:val="2"/>
-            <w:tcBorders>
               <w:right w:val="nil"/>
             </w:tcBorders>
             <w:vAlign w:val="center"/>
@@ -353,7 +398,37 @@
                 <w:sz w:val="22"/>
                 <w:szCs w:val="22"/>
               </w:rPr>
-              <w:t>Penyajian ke</w:t>
+              <w:t>:</w:t>
+            </w:r>
+          </w:p>
+        </w:tc>
+        <w:tc>
+          <w:tcPr>
+            <w:tcW w:w="2994" w:type="dxa"/>
+            <w:gridSpan w:val="2"/>
+            <w:tcBorders>
+              <w:left w:val="nil"/>
+            </w:tcBorders>
+            <w:vAlign w:val="center"/>
+          </w:tcPr>
+          <w:p>
+            <w:r>
+              <w:t>Menciptakan Karya Desain</w:t>
+            </w:r>
+          </w:p>
+        </w:tc>
+        <w:tc>
+          <w:tcPr>
+            <w:tcW w:w="1944" w:type="dxa"/>
+            <w:gridSpan w:val="2"/>
+            <w:tcBorders>
+              <w:right w:val="nil"/>
+            </w:tcBorders>
+            <w:vAlign w:val="center"/>
+          </w:tcPr>
+          <w:p>
+            <w:r>
+              <w:t>Waktu</w:t>
             </w:r>
           </w:p>
         </w:tc>
@@ -367,22 +442,7 @@
             <w:vAlign w:val="center"/>
           </w:tcPr>
           <w:p>
-            <w:pPr>
-              <w:spacing w:before="60" w:after="60"/>
-              <w:rPr>
-                <w:rFonts w:ascii="Tahoma" w:eastAsia="Tahoma" w:hAnsi="Tahoma" w:cs="Tahoma"/>
-                <w:b/>
-                <w:sz w:val="22"/>
-                <w:szCs w:val="22"/>
-              </w:rPr>
-            </w:pPr>
-            <w:r>
-              <w:rPr>
-                <w:rFonts w:ascii="Tahoma" w:eastAsia="Tahoma" w:hAnsi="Tahoma" w:cs="Tahoma"/>
-                <w:b/>
-                <w:sz w:val="22"/>
-                <w:szCs w:val="22"/>
-              </w:rPr>
+            <w:r>
               <w:t>:</w:t>
             </w:r>
           </w:p>
@@ -398,166 +458,20 @@
           </w:tcPr>
           <w:p>
             <w:r>
-              <w:t>2</w:t>
+              <w:t>180 menit</w:t>
             </w:r>
           </w:p>
         </w:tc>
       </w:tr>
       <w:tr>
-        <w:trPr>
-          <w:trHeight w:val="60"/>
-        </w:trPr>
-        <w:tc>
-          <w:tcPr>
-            <w:tcW w:w="1962" w:type="dxa"/>
-            <w:tcBorders>
-              <w:right w:val="nil"/>
-            </w:tcBorders>
-            <w:vAlign w:val="center"/>
-          </w:tcPr>
-          <w:p>
-            <w:pPr>
-              <w:spacing w:before="60" w:after="60"/>
-              <w:rPr>
-                <w:rFonts w:ascii="Tahoma" w:eastAsia="Tahoma" w:hAnsi="Tahoma" w:cs="Tahoma"/>
-                <w:b/>
-                <w:sz w:val="22"/>
-                <w:szCs w:val="22"/>
-              </w:rPr>
-            </w:pPr>
-            <w:r>
-              <w:rPr>
-                <w:rFonts w:ascii="Tahoma" w:eastAsia="Tahoma" w:hAnsi="Tahoma" w:cs="Tahoma"/>
-                <w:b/>
-                <w:sz w:val="22"/>
-                <w:szCs w:val="22"/>
-              </w:rPr>
-              <w:t>Judul Unit Kompetensi</w:t>
-            </w:r>
-          </w:p>
-        </w:tc>
-        <w:tc>
-          <w:tcPr>
-            <w:tcW w:w="296" w:type="dxa"/>
-            <w:tcBorders>
-              <w:left w:val="nil"/>
-              <w:right w:val="nil"/>
-            </w:tcBorders>
-            <w:vAlign w:val="center"/>
-          </w:tcPr>
-          <w:p>
-            <w:pPr>
-              <w:spacing w:before="60" w:after="60"/>
-              <w:rPr>
-                <w:rFonts w:ascii="Tahoma" w:eastAsia="Tahoma" w:hAnsi="Tahoma" w:cs="Tahoma"/>
-                <w:b/>
-                <w:sz w:val="22"/>
-                <w:szCs w:val="22"/>
-              </w:rPr>
-            </w:pPr>
-            <w:r>
-              <w:rPr>
-                <w:rFonts w:ascii="Tahoma" w:eastAsia="Tahoma" w:hAnsi="Tahoma" w:cs="Tahoma"/>
-                <w:b/>
-                <w:sz w:val="22"/>
-                <w:szCs w:val="22"/>
-              </w:rPr>
-              <w:t>:</w:t>
-            </w:r>
-          </w:p>
-        </w:tc>
-        <w:tc>
-          <w:tcPr>
-            <w:tcW w:w="2994" w:type="dxa"/>
-            <w:gridSpan w:val="2"/>
-            <w:tcBorders>
-              <w:left w:val="nil"/>
-            </w:tcBorders>
-            <w:vAlign w:val="center"/>
-          </w:tcPr>
-          <w:p>
-            <w:pPr>
-              <w:spacing w:before="60" w:after="60"/>
-              <w:rPr>
-                <w:rFonts w:ascii="Tahoma" w:eastAsia="Tahoma" w:hAnsi="Tahoma" w:cs="Tahoma"/>
-                <w:sz w:val="22"/>
-                <w:szCs w:val="22"/>
-              </w:rPr>
-            </w:pPr>
-          </w:p>
-        </w:tc>
-        <w:tc>
-          <w:tcPr>
-            <w:tcW w:w="1944" w:type="dxa"/>
-            <w:gridSpan w:val="2"/>
-            <w:tcBorders>
-              <w:right w:val="nil"/>
-            </w:tcBorders>
-            <w:vAlign w:val="center"/>
-          </w:tcPr>
-          <w:p>
-            <w:pPr>
-              <w:spacing w:before="60" w:after="60"/>
-              <w:rPr>
-                <w:rFonts w:ascii="Tahoma" w:eastAsia="Tahoma" w:hAnsi="Tahoma" w:cs="Tahoma"/>
-                <w:b/>
-                <w:sz w:val="22"/>
-                <w:szCs w:val="22"/>
-              </w:rPr>
-            </w:pPr>
-            <w:r>
-              <w:rPr>
-                <w:rFonts w:ascii="Tahoma" w:eastAsia="Tahoma" w:hAnsi="Tahoma" w:cs="Tahoma"/>
-                <w:b/>
-                <w:sz w:val="22"/>
-                <w:szCs w:val="22"/>
-              </w:rPr>
-              <w:t xml:space="preserve">Waktu </w:t>
-            </w:r>
-          </w:p>
-        </w:tc>
-        <w:tc>
-          <w:tcPr>
-            <w:tcW w:w="283" w:type="dxa"/>
-            <w:tcBorders>
-              <w:left w:val="nil"/>
-              <w:right w:val="nil"/>
-            </w:tcBorders>
-            <w:vAlign w:val="center"/>
-          </w:tcPr>
-          <w:p>
-            <w:pPr>
-              <w:spacing w:before="60" w:after="60"/>
-              <w:rPr>
-                <w:rFonts w:ascii="Tahoma" w:eastAsia="Tahoma" w:hAnsi="Tahoma" w:cs="Tahoma"/>
-                <w:b/>
-                <w:sz w:val="22"/>
-                <w:szCs w:val="22"/>
-              </w:rPr>
-            </w:pPr>
-            <w:r>
-              <w:rPr>
-                <w:rFonts w:ascii="Tahoma" w:eastAsia="Tahoma" w:hAnsi="Tahoma" w:cs="Tahoma"/>
-                <w:b/>
-                <w:sz w:val="22"/>
-                <w:szCs w:val="22"/>
-              </w:rPr>
-              <w:t>:</w:t>
-            </w:r>
-          </w:p>
-        </w:tc>
-        <w:tc>
-          <w:tcPr>
-            <w:tcW w:w="2385" w:type="dxa"/>
-            <w:gridSpan w:val="3"/>
-            <w:tcBorders>
-              <w:left w:val="nil"/>
-            </w:tcBorders>
-            <w:vAlign w:val="center"/>
-          </w:tcPr>
-          <w:p>
-            <w:r>
-              <w:t>180 menit</w:t>
+        <w:tc>
+          <w:tcPr>
+            <w:tcW w:w="9864" w:type="dxa"/>
+            <w:gridSpan w:val="10"/>
+          </w:tcPr>
+          <w:p>
+            <w:r>
+              <w:t>Prinsip Komposisi Visual (Balance, Contrast, Hierarchy, &amp; Alignment)</w:t>
             </w:r>
           </w:p>
         </w:tc>
@@ -570,20 +484,7 @@
           </w:tcPr>
           <w:p>
             <w:r>
-              <w:t>Prinsip Komposisi Visual (Balance, Contrast, Hierarchy)</w:t>
-            </w:r>
-          </w:p>
-        </w:tc>
-      </w:tr>
-      <w:tr>
-        <w:tc>
-          <w:tcPr>
-            <w:tcW w:w="9864" w:type="dxa"/>
-            <w:gridSpan w:val="10"/>
-          </w:tcPr>
-          <w:p>
-            <w:r>
-              <w:t>Menerapkan prinsip keseimbangan, kontras, dan hierarki pada layout desain.</w:t>
+              <w:t>Setelah selesai mengikuti pelatihan ini peserta kompeten dalam menerapkan 4 prinsip dasar komposisi visual (keseimbangan, kontras, hierarki visual, dan perataan) pada rancangan layout desain secara presisi.</w:t>
             </w:r>
           </w:p>
         </w:tc>
@@ -601,6 +502,72 @@
             <w:tcBorders>
               <w:bottom w:val="single" w:sz="4" w:space="0" w:color="000000"/>
             </w:tcBorders>
+          </w:tcPr>
+          <w:p>
+            <w:r>
+              <w:t>Metode Mengajar</w:t>
+            </w:r>
+          </w:p>
+        </w:tc>
+        <w:tc>
+          <w:tcPr>
+            <w:tcW w:w="7189" w:type="dxa"/>
+            <w:gridSpan w:val="6"/>
+          </w:tcPr>
+          <w:p>
+            <w:r>
+              <w:t>Ceramah</w:t>
+              <w:br/>
+              <w:t>Demonstrasi</w:t>
+              <w:br/>
+              <w:t>Praktikum</w:t>
+            </w:r>
+          </w:p>
+        </w:tc>
+      </w:tr>
+      <w:tr>
+        <w:trPr>
+          <w:gridAfter w:val="1"/>
+          <w:wAfter w:w="10" w:type="dxa"/>
+          <w:trHeight w:val="754"/>
+        </w:trPr>
+        <w:tc>
+          <w:tcPr>
+            <w:tcW w:w="2665" w:type="dxa"/>
+            <w:gridSpan w:val="3"/>
+            <w:vMerge w:val="restart"/>
+          </w:tcPr>
+          <w:p>
+            <w:r>
+              <w:t>Media Pembelajaran</w:t>
+              <w:br/>
+              <w:t>(Media, Alat, Bahan)</w:t>
+            </w:r>
+          </w:p>
+        </w:tc>
+        <w:tc>
+          <w:tcPr>
+            <w:tcW w:w="7189" w:type="dxa"/>
+            <w:gridSpan w:val="6"/>
+          </w:tcPr>
+          <w:p>
+            <w:r>
+              <w:t>Media Power Point, Slide Analisis Karya &amp; Sample Layout Poster</w:t>
+            </w:r>
+          </w:p>
+        </w:tc>
+      </w:tr>
+      <w:tr>
+        <w:trPr>
+          <w:gridAfter w:val="1"/>
+          <w:wAfter w:w="10" w:type="dxa"/>
+          <w:trHeight w:val="754"/>
+        </w:trPr>
+        <w:tc>
+          <w:tcPr>
+            <w:tcW w:w="2665" w:type="dxa"/>
+            <w:gridSpan w:val="3"/>
+            <w:vMerge/>
           </w:tcPr>
           <w:p>
             <w:pPr>
@@ -613,15 +580,6 @@
                 <w:szCs w:val="22"/>
               </w:rPr>
             </w:pPr>
-            <w:r>
-              <w:rPr>
-                <w:rFonts w:ascii="Tahoma" w:eastAsia="Tahoma" w:hAnsi="Tahoma" w:cs="Tahoma"/>
-                <w:b/>
-                <w:sz w:val="22"/>
-                <w:szCs w:val="22"/>
-              </w:rPr>
-              <w:t>Metode Mengajar</w:t>
-            </w:r>
           </w:p>
         </w:tc>
         <w:tc>
@@ -630,28 +588,9 @@
             <w:gridSpan w:val="6"/>
           </w:tcPr>
           <w:p>
-            <w:pPr>
-              <w:numPr>
-                <w:ilvl w:val="0"/>
-                <w:numId w:val="2"/>
-              </w:numPr>
-              <w:pBdr>
-                <w:top w:val="nil"/>
-                <w:left w:val="nil"/>
-                <w:bottom w:val="nil"/>
-                <w:right w:val="nil"/>
-                <w:between w:val="nil"/>
-              </w:pBdr>
-              <w:spacing w:after="120"/>
-              <w:ind w:left="294" w:hanging="284"/>
-              <w:jc w:val="both"/>
-              <w:rPr>
-                <w:rFonts w:ascii="Tahoma" w:eastAsia="Tahoma" w:hAnsi="Tahoma" w:cs="Tahoma"/>
-                <w:color w:val="000000" w:themeColor="text1"/>
-                <w:sz w:val="22"/>
-                <w:szCs w:val="22"/>
-              </w:rPr>
-            </w:pPr>
+            <w:r>
+              <w:t>Alat Proyektor dan Layar, Perangkat Komputer / Workstation Lab, Papan Tulis, Spidol dan Penghapus</w:t>
+            </w:r>
           </w:p>
         </w:tc>
       </w:tr>
@@ -665,7 +604,10 @@
           <w:tcPr>
             <w:tcW w:w="2665" w:type="dxa"/>
             <w:gridSpan w:val="3"/>
-            <w:vMerge w:val="restart"/>
+            <w:vMerge/>
+            <w:tcBorders>
+              <w:bottom w:val="nil"/>
+            </w:tcBorders>
           </w:tcPr>
           <w:p>
             <w:pPr>
@@ -678,43 +620,6 @@
                 <w:szCs w:val="22"/>
               </w:rPr>
             </w:pPr>
-            <w:r>
-              <w:rPr>
-                <w:rFonts w:ascii="Tahoma" w:eastAsia="Tahoma" w:hAnsi="Tahoma" w:cs="Tahoma"/>
-                <w:b/>
-                <w:sz w:val="22"/>
-                <w:szCs w:val="22"/>
-              </w:rPr>
-              <w:t>Media Pembelajaran</w:t>
-            </w:r>
-          </w:p>
-          <w:p>
-            <w:pPr>
-              <w:jc w:val="both"/>
-              <w:rPr>
-                <w:rFonts w:ascii="Tahoma" w:eastAsia="Tahoma" w:hAnsi="Tahoma" w:cs="Tahoma"/>
-                <w:sz w:val="22"/>
-                <w:szCs w:val="22"/>
-              </w:rPr>
-            </w:pPr>
-            <w:r>
-              <w:rPr>
-                <w:rFonts w:ascii="Tahoma" w:eastAsia="Tahoma" w:hAnsi="Tahoma" w:cs="Tahoma"/>
-                <w:sz w:val="22"/>
-                <w:szCs w:val="22"/>
-              </w:rPr>
-              <w:t>(Media, Alat, Bahan)</w:t>
-            </w:r>
-          </w:p>
-          <w:p>
-            <w:pPr>
-              <w:jc w:val="both"/>
-              <w:rPr>
-                <w:rFonts w:ascii="Tahoma" w:eastAsia="Tahoma" w:hAnsi="Tahoma" w:cs="Tahoma"/>
-                <w:sz w:val="22"/>
-                <w:szCs w:val="22"/>
-              </w:rPr>
-            </w:pPr>
           </w:p>
         </w:tc>
         <w:tc>
@@ -723,230 +628,9 @@
             <w:gridSpan w:val="6"/>
           </w:tcPr>
           <w:p>
-            <w:pPr>
-              <w:pBdr>
-                <w:top w:val="nil"/>
-                <w:left w:val="nil"/>
-                <w:bottom w:val="nil"/>
-                <w:right w:val="nil"/>
-                <w:between w:val="nil"/>
-              </w:pBdr>
-              <w:spacing w:before="120" w:line="276" w:lineRule="auto"/>
-              <w:ind w:left="52"/>
-              <w:jc w:val="both"/>
-              <w:rPr>
-                <w:rFonts w:ascii="Tahoma" w:eastAsia="Tahoma" w:hAnsi="Tahoma" w:cs="Tahoma"/>
-                <w:color w:val="000000" w:themeColor="text1"/>
-                <w:sz w:val="22"/>
-                <w:szCs w:val="22"/>
-              </w:rPr>
-            </w:pPr>
-            <w:r>
-              <w:rPr>
-                <w:rFonts w:ascii="Tahoma" w:eastAsia="Tahoma" w:hAnsi="Tahoma" w:cs="Tahoma"/>
-                <w:color w:val="000000" w:themeColor="text1"/>
-                <w:sz w:val="22"/>
-                <w:szCs w:val="22"/>
-              </w:rPr>
-              <w:t>Media</w:t>
-            </w:r>
-          </w:p>
-          <w:p>
-            <w:pPr>
-              <w:numPr>
-                <w:ilvl w:val="0"/>
-                <w:numId w:val="3"/>
-              </w:numPr>
-              <w:pBdr>
-                <w:top w:val="nil"/>
-                <w:left w:val="nil"/>
-                <w:bottom w:val="nil"/>
-                <w:right w:val="nil"/>
-                <w:between w:val="nil"/>
-              </w:pBdr>
-              <w:spacing w:after="120" w:line="276" w:lineRule="auto"/>
-              <w:ind w:left="294" w:hanging="242"/>
-              <w:jc w:val="both"/>
-              <w:rPr>
-                <w:rFonts w:ascii="Tahoma" w:eastAsia="Tahoma" w:hAnsi="Tahoma" w:cs="Tahoma"/>
-                <w:color w:val="000000" w:themeColor="text1"/>
-                <w:sz w:val="22"/>
-                <w:szCs w:val="22"/>
-              </w:rPr>
-            </w:pPr>
-          </w:p>
-        </w:tc>
-      </w:tr>
-      <w:tr>
-        <w:trPr>
-          <w:gridAfter w:val="1"/>
-          <w:wAfter w:w="10" w:type="dxa"/>
-          <w:trHeight w:val="754"/>
-        </w:trPr>
-        <w:tc>
-          <w:tcPr>
-            <w:tcW w:w="2665" w:type="dxa"/>
-            <w:gridSpan w:val="3"/>
-            <w:vMerge/>
-          </w:tcPr>
-          <w:p>
-            <w:pPr>
-              <w:spacing w:before="120"/>
-              <w:jc w:val="both"/>
-              <w:rPr>
-                <w:rFonts w:ascii="Tahoma" w:eastAsia="Tahoma" w:hAnsi="Tahoma" w:cs="Tahoma"/>
-                <w:b/>
-                <w:sz w:val="22"/>
-                <w:szCs w:val="22"/>
-              </w:rPr>
-            </w:pPr>
-          </w:p>
-        </w:tc>
-        <w:tc>
-          <w:tcPr>
-            <w:tcW w:w="7189" w:type="dxa"/>
-            <w:gridSpan w:val="6"/>
-          </w:tcPr>
-          <w:p>
-            <w:pPr>
-              <w:pBdr>
-                <w:top w:val="nil"/>
-                <w:left w:val="nil"/>
-                <w:bottom w:val="nil"/>
-                <w:right w:val="nil"/>
-                <w:between w:val="nil"/>
-              </w:pBdr>
-              <w:spacing w:before="120" w:line="276" w:lineRule="auto"/>
-              <w:ind w:left="52"/>
-              <w:jc w:val="both"/>
-              <w:rPr>
-                <w:rFonts w:ascii="Tahoma" w:eastAsia="Tahoma" w:hAnsi="Tahoma" w:cs="Tahoma"/>
-                <w:color w:val="000000" w:themeColor="text1"/>
-                <w:sz w:val="22"/>
-                <w:szCs w:val="22"/>
-              </w:rPr>
-            </w:pPr>
-            <w:r>
-              <w:rPr>
-                <w:rFonts w:ascii="Tahoma" w:eastAsia="Tahoma" w:hAnsi="Tahoma" w:cs="Tahoma"/>
-                <w:color w:val="000000" w:themeColor="text1"/>
-                <w:sz w:val="22"/>
-                <w:szCs w:val="22"/>
-              </w:rPr>
-              <w:t>Alat</w:t>
-            </w:r>
-          </w:p>
-          <w:p>
-            <w:pPr>
-              <w:numPr>
-                <w:ilvl w:val="0"/>
-                <w:numId w:val="7"/>
-              </w:numPr>
-              <w:pBdr>
-                <w:top w:val="nil"/>
-                <w:left w:val="nil"/>
-                <w:bottom w:val="nil"/>
-                <w:right w:val="nil"/>
-                <w:between w:val="nil"/>
-              </w:pBdr>
-              <w:spacing w:after="120" w:line="276" w:lineRule="auto"/>
-              <w:ind w:left="294" w:hanging="242"/>
-              <w:jc w:val="both"/>
-              <w:rPr>
-                <w:rFonts w:ascii="Tahoma" w:eastAsia="Tahoma" w:hAnsi="Tahoma" w:cs="Tahoma"/>
-                <w:color w:val="000000" w:themeColor="text1"/>
-                <w:sz w:val="22"/>
-                <w:szCs w:val="22"/>
-              </w:rPr>
-            </w:pPr>
-          </w:p>
-        </w:tc>
-      </w:tr>
-      <w:tr>
-        <w:trPr>
-          <w:gridAfter w:val="1"/>
-          <w:wAfter w:w="10" w:type="dxa"/>
-          <w:trHeight w:val="754"/>
-        </w:trPr>
-        <w:tc>
-          <w:tcPr>
-            <w:tcW w:w="2665" w:type="dxa"/>
-            <w:gridSpan w:val="3"/>
-            <w:vMerge/>
-            <w:tcBorders>
-              <w:bottom w:val="nil"/>
-            </w:tcBorders>
-          </w:tcPr>
-          <w:p>
-            <w:pPr>
-              <w:spacing w:before="120"/>
-              <w:jc w:val="both"/>
-              <w:rPr>
-                <w:rFonts w:ascii="Tahoma" w:eastAsia="Tahoma" w:hAnsi="Tahoma" w:cs="Tahoma"/>
-                <w:b/>
-                <w:sz w:val="22"/>
-                <w:szCs w:val="22"/>
-              </w:rPr>
-            </w:pPr>
-          </w:p>
-        </w:tc>
-        <w:tc>
-          <w:tcPr>
-            <w:tcW w:w="7189" w:type="dxa"/>
-            <w:gridSpan w:val="6"/>
-          </w:tcPr>
-          <w:p>
-            <w:pPr>
-              <w:pBdr>
-                <w:top w:val="nil"/>
-                <w:left w:val="nil"/>
-                <w:bottom w:val="nil"/>
-                <w:right w:val="nil"/>
-                <w:between w:val="nil"/>
-              </w:pBdr>
-              <w:spacing w:before="120" w:line="276" w:lineRule="auto"/>
-              <w:ind w:left="52"/>
-              <w:jc w:val="both"/>
-              <w:rPr>
-                <w:rFonts w:ascii="Tahoma" w:eastAsia="Tahoma" w:hAnsi="Tahoma" w:cs="Tahoma"/>
-                <w:color w:val="000000" w:themeColor="text1"/>
-                <w:sz w:val="22"/>
-                <w:szCs w:val="22"/>
-              </w:rPr>
-            </w:pPr>
-            <w:r>
-              <w:rPr>
-                <w:rFonts w:ascii="Tahoma" w:eastAsia="Tahoma" w:hAnsi="Tahoma" w:cs="Tahoma"/>
-                <w:color w:val="000000" w:themeColor="text1"/>
-                <w:sz w:val="22"/>
-                <w:szCs w:val="22"/>
-              </w:rPr>
-              <w:t>Bahan</w:t>
-            </w:r>
-          </w:p>
-          <w:p>
-            <w:pPr>
-              <w:numPr>
-                <w:ilvl w:val="0"/>
-                <w:numId w:val="8"/>
-              </w:numPr>
-              <w:pBdr>
-                <w:top w:val="nil"/>
-                <w:left w:val="nil"/>
-                <w:bottom w:val="nil"/>
-                <w:right w:val="nil"/>
-                <w:between w:val="nil"/>
-              </w:pBdr>
-              <w:spacing w:after="120" w:line="276" w:lineRule="auto"/>
-              <w:ind w:left="294" w:hanging="242"/>
-              <w:jc w:val="both"/>
-              <w:rPr>
-                <w:rFonts w:ascii="Tahoma" w:eastAsia="Tahoma" w:hAnsi="Tahoma" w:cs="Tahoma"/>
-                <w:color w:val="000000" w:themeColor="text1"/>
-                <w:sz w:val="22"/>
-                <w:szCs w:val="22"/>
-              </w:rPr>
-            </w:pPr>
+            <w:r>
+              <w:t>Flashdisk, File Latihan Elemen Grafis Acak, Modul Komposisi Visual</w:t>
+            </w:r>
           </w:p>
         </w:tc>
       </w:tr>
@@ -988,21 +672,9 @@
             <w:gridSpan w:val="6"/>
           </w:tcPr>
           <w:p>
-            <w:pPr>
-              <w:numPr>
-                <w:ilvl w:val="0"/>
-                <w:numId w:val="5"/>
-              </w:numPr>
-              <w:spacing w:after="120" w:line="276" w:lineRule="auto"/>
-              <w:ind w:left="294" w:hanging="284"/>
-              <w:jc w:val="both"/>
-              <w:rPr>
-                <w:rFonts w:ascii="Tahoma" w:eastAsia="Tahoma" w:hAnsi="Tahoma" w:cs="Tahoma"/>
-                <w:color w:val="000000" w:themeColor="text1"/>
-                <w:sz w:val="22"/>
-                <w:szCs w:val="22"/>
-              </w:rPr>
-            </w:pPr>
+            <w:r>
+              <w:t>Persiapan</w:t>
+            </w:r>
           </w:p>
         </w:tc>
       </w:tr>
@@ -1050,11 +722,15 @@
           </w:tcPr>
           <w:p>
             <w:r>
-              <w:t>1. Salam &amp; Absensi</w:t>
+              <w:t>1. Memberi salam dan Memperkenalkan diri</w:t>
               <w:br/>
-              <w:t>2. Review brief</w:t>
+              <w:t>2. Mengabsen peserta pelatihan</w:t>
               <w:br/>
-              <w:t>3. Apersepsi: Dampak desain berantakan</w:t>
+              <w:t>3. Menjelaskan safety induction dan tata tertib laboratorium TIK</w:t>
+              <w:br/>
+              <w:t>4. Review materi pemicu: Dampak tata letak elemen desain yang berantakan terhadap pembaca</w:t>
+              <w:br/>
+              <w:t>5. Menyampaikan judul unit dan tujuan pembelajaran</w:t>
             </w:r>
           </w:p>
         </w:tc>
@@ -1063,24 +739,7 @@
             <w:tcW w:w="1850" w:type="dxa"/>
           </w:tcPr>
           <w:p>
-            <w:pPr>
-              <w:spacing w:before="120" w:after="120"/>
-              <w:ind w:left="26"/>
-              <w:jc w:val="center"/>
-              <w:rPr>
-                <w:rFonts w:ascii="Tahoma" w:eastAsia="Tahoma" w:hAnsi="Tahoma" w:cs="Tahoma"/>
-                <w:b/>
-                <w:sz w:val="22"/>
-                <w:szCs w:val="22"/>
-              </w:rPr>
-            </w:pPr>
-            <w:r>
-              <w:rPr>
-                <w:rFonts w:ascii="Tahoma" w:eastAsia="Tahoma" w:hAnsi="Tahoma" w:cs="Tahoma"/>
-                <w:b/>
-                <w:sz w:val="22"/>
-                <w:szCs w:val="22"/>
-              </w:rPr>
+            <w:r>
               <w:t>Perkiraan Waktu</w:t>
             </w:r>
           </w:p>
@@ -1147,15 +806,9 @@
             <w:tcW w:w="1850" w:type="dxa"/>
           </w:tcPr>
           <w:p>
-            <w:pPr>
-              <w:ind w:left="26"/>
-              <w:jc w:val="center"/>
-              <w:rPr>
-                <w:rFonts w:ascii="Tahoma" w:eastAsia="Tahoma" w:hAnsi="Tahoma" w:cs="Tahoma"/>
-                <w:sz w:val="22"/>
-                <w:szCs w:val="22"/>
-              </w:rPr>
-            </w:pPr>
+            <w:r>
+              <w:t>10 menit</w:t>
+            </w:r>
           </w:p>
         </w:tc>
       </w:tr>
@@ -1174,25 +827,7 @@
             <w:vAlign w:val="center"/>
           </w:tcPr>
           <w:p>
-            <w:pPr>
-              <w:pStyle w:val="ListParagraph"/>
-              <w:numPr>
-                <w:ilvl w:val="0"/>
-                <w:numId w:val="6"/>
-              </w:numPr>
-              <w:spacing w:before="120" w:after="120"/>
-              <w:ind w:left="294" w:hanging="284"/>
-              <w:jc w:val="both"/>
-              <w:rPr>
-                <w:rFonts w:ascii="Tahoma" w:eastAsia="Tahoma" w:hAnsi="Tahoma" w:cs="Tahoma"/>
-                <w:i/>
-              </w:rPr>
-            </w:pPr>
-            <w:r>
-              <w:rPr>
-                <w:rFonts w:ascii="Tahoma" w:eastAsia="Tahoma" w:hAnsi="Tahoma" w:cs="Tahoma"/>
-                <w:b/>
-              </w:rPr>
+            <w:r>
               <w:t>Penyajian</w:t>
             </w:r>
           </w:p>
@@ -1278,46 +913,9 @@
             <w:vAlign w:val="center"/>
           </w:tcPr>
           <w:p>
-            <w:pPr>
-              <w:jc w:val="center"/>
-              <w:rPr>
-                <w:rFonts w:ascii="Tahoma" w:eastAsia="Tahoma" w:hAnsi="Tahoma" w:cs="Tahoma"/>
-                <w:b/>
-                <w:sz w:val="22"/>
-                <w:szCs w:val="22"/>
-              </w:rPr>
-            </w:pPr>
-          </w:p>
-          <w:p>
-            <w:pPr>
-              <w:jc w:val="center"/>
-              <w:rPr>
-                <w:rFonts w:ascii="Tahoma" w:eastAsia="Tahoma" w:hAnsi="Tahoma" w:cs="Tahoma"/>
-                <w:b/>
-                <w:sz w:val="22"/>
-                <w:szCs w:val="22"/>
-              </w:rPr>
-            </w:pPr>
-            <w:r>
-              <w:rPr>
-                <w:rFonts w:ascii="Tahoma" w:eastAsia="Tahoma" w:hAnsi="Tahoma" w:cs="Tahoma"/>
-                <w:b/>
-                <w:sz w:val="22"/>
-                <w:szCs w:val="22"/>
-              </w:rPr>
+            <w:r>
               <w:t>Sub Judul</w:t>
             </w:r>
-          </w:p>
-          <w:p>
-            <w:pPr>
-              <w:jc w:val="center"/>
-              <w:rPr>
-                <w:rFonts w:ascii="Tahoma" w:eastAsia="Tahoma" w:hAnsi="Tahoma" w:cs="Tahoma"/>
-                <w:i/>
-                <w:sz w:val="22"/>
-                <w:szCs w:val="22"/>
-              </w:rPr>
-            </w:pPr>
           </w:p>
         </w:tc>
         <w:tc>
@@ -1327,46 +925,9 @@
             <w:vAlign w:val="center"/>
           </w:tcPr>
           <w:p>
-            <w:pPr>
-              <w:jc w:val="center"/>
-              <w:rPr>
-                <w:rFonts w:ascii="Tahoma" w:eastAsia="Tahoma" w:hAnsi="Tahoma" w:cs="Tahoma"/>
-                <w:b/>
-                <w:sz w:val="22"/>
-                <w:szCs w:val="22"/>
-              </w:rPr>
-            </w:pPr>
-          </w:p>
-          <w:p>
-            <w:pPr>
-              <w:jc w:val="center"/>
-              <w:rPr>
-                <w:rFonts w:ascii="Tahoma" w:eastAsia="Tahoma" w:hAnsi="Tahoma" w:cs="Tahoma"/>
-                <w:b/>
-                <w:sz w:val="22"/>
-                <w:szCs w:val="22"/>
-              </w:rPr>
-            </w:pPr>
-            <w:r>
-              <w:rPr>
-                <w:rFonts w:ascii="Tahoma" w:eastAsia="Tahoma" w:hAnsi="Tahoma" w:cs="Tahoma"/>
-                <w:b/>
-                <w:sz w:val="22"/>
-                <w:szCs w:val="22"/>
-              </w:rPr>
+            <w:r>
               <w:t>Uraian Kegiatan</w:t>
             </w:r>
-          </w:p>
-          <w:p>
-            <w:pPr>
-              <w:jc w:val="center"/>
-              <w:rPr>
-                <w:rFonts w:ascii="Tahoma" w:eastAsia="Tahoma" w:hAnsi="Tahoma" w:cs="Tahoma"/>
-                <w:i/>
-                <w:sz w:val="22"/>
-                <w:szCs w:val="22"/>
-              </w:rPr>
-            </w:pPr>
           </w:p>
         </w:tc>
         <w:tc>
@@ -1376,21 +937,7 @@
             <w:vAlign w:val="center"/>
           </w:tcPr>
           <w:p>
-            <w:pPr>
-              <w:jc w:val="center"/>
-              <w:rPr>
-                <w:rFonts w:ascii="Tahoma" w:eastAsia="Tahoma" w:hAnsi="Tahoma" w:cs="Tahoma"/>
-                <w:sz w:val="22"/>
-                <w:szCs w:val="22"/>
-              </w:rPr>
-            </w:pPr>
-            <w:r>
-              <w:rPr>
-                <w:rFonts w:ascii="Tahoma" w:eastAsia="Tahoma" w:hAnsi="Tahoma" w:cs="Tahoma"/>
-                <w:b/>
-                <w:sz w:val="22"/>
-                <w:szCs w:val="22"/>
-              </w:rPr>
+            <w:r>
               <w:t>Media Pembelajaran</w:t>
             </w:r>
           </w:p>
@@ -1401,32 +948,8 @@
             <w:vAlign w:val="center"/>
           </w:tcPr>
           <w:p>
-            <w:pPr>
-              <w:jc w:val="center"/>
-              <w:rPr>
-                <w:rFonts w:ascii="Tahoma" w:eastAsia="Tahoma" w:hAnsi="Tahoma" w:cs="Tahoma"/>
-                <w:i/>
-                <w:sz w:val="22"/>
-                <w:szCs w:val="22"/>
-              </w:rPr>
-            </w:pPr>
-            <w:r>
-              <w:rPr>
-                <w:rFonts w:ascii="Tahoma" w:eastAsia="Tahoma" w:hAnsi="Tahoma" w:cs="Tahoma"/>
-                <w:b/>
-                <w:sz w:val="22"/>
-                <w:szCs w:val="22"/>
-              </w:rPr>
+            <w:r>
               <w:t>Perkiraan Waktu</w:t>
-            </w:r>
-            <w:r>
-              <w:rPr>
-                <w:rFonts w:ascii="Tahoma" w:eastAsia="Tahoma" w:hAnsi="Tahoma" w:cs="Tahoma"/>
-                <w:i/>
-                <w:sz w:val="22"/>
-                <w:szCs w:val="22"/>
-              </w:rPr>
-              <w:t xml:space="preserve"> </w:t>
             </w:r>
           </w:p>
         </w:tc>
@@ -1444,7 +967,7 @@
           </w:tcPr>
           <w:p>
             <w:r>
-              <w:t>Teori Komposisi &amp; Hierarchy</w:t>
+              <w:t>Teori Prinsip Komposisi &amp; Visual Hierarchy</w:t>
             </w:r>
           </w:p>
         </w:tc>
@@ -1455,7 +978,17 @@
           </w:tcPr>
           <w:p>
             <w:r>
-              <w:t>Penjelasan Balance, Contrast, Alignment, dan Proximity dalam tata letak visual.</w:t>
+              <w:t>Instruktur menjelaskan kepada peserta terkait:</w:t>
+              <w:br/>
+              <w:t>- Balance (Keseimbangan Simetris vs Asimetris)</w:t>
+              <w:br/>
+              <w:t>- Contrast untuk menciptakan Focal Point / pusat perhatian utama</w:t>
+              <w:br/>
+              <w:t>- Visual Hierarchy untuk mengarahkan alur baca pembaca dari judul ke isi</w:t>
+              <w:br/>
+              <w:t>- Alignment &amp; Proximity untuk kerapihan dan keterikatan antar elemen visual</w:t>
+              <w:br/>
+              <w:t>Instruktur memberikan kesempatan kepada peserta untuk mengajukan pertanyaan.</w:t>
             </w:r>
           </w:p>
         </w:tc>
@@ -1465,23 +998,9 @@
             <w:gridSpan w:val="3"/>
           </w:tcPr>
           <w:p>
-            <w:pPr>
-              <w:pBdr>
-                <w:top w:val="nil"/>
-                <w:left w:val="nil"/>
-                <w:bottom w:val="nil"/>
-                <w:right w:val="nil"/>
-                <w:between w:val="nil"/>
-              </w:pBdr>
-              <w:spacing w:before="60" w:line="276" w:lineRule="auto"/>
-              <w:ind w:left="253" w:right="89"/>
-              <w:rPr>
-                <w:rFonts w:ascii="Tahoma" w:eastAsia="Tahoma" w:hAnsi="Tahoma" w:cs="Tahoma"/>
-                <w:color w:val="000000"/>
-                <w:sz w:val="22"/>
-                <w:szCs w:val="22"/>
-              </w:rPr>
-            </w:pPr>
+            <w:r>
+              <w:t>Power Point &amp; Slide Contoh Layout</w:t>
+            </w:r>
           </w:p>
         </w:tc>
         <w:tc>
@@ -1489,15 +1008,9 @@
             <w:tcW w:w="1850" w:type="dxa"/>
           </w:tcPr>
           <w:p>
-            <w:pPr>
-              <w:spacing w:before="60"/>
-              <w:jc w:val="center"/>
-              <w:rPr>
-                <w:rFonts w:ascii="Tahoma" w:eastAsia="Tahoma" w:hAnsi="Tahoma" w:cs="Tahoma"/>
-                <w:sz w:val="22"/>
-                <w:szCs w:val="22"/>
-              </w:rPr>
-            </w:pPr>
+            <w:r>
+              <w:t>35 menit</w:t>
+            </w:r>
           </w:p>
         </w:tc>
       </w:tr>
@@ -1514,7 +1027,7 @@
           </w:tcPr>
           <w:p>
             <w:r>
-              <w:t>Demonstrasi Layouting Rapi</w:t>
+              <w:t>Demonstrasi Layouting Komposisi Terstruktur</w:t>
             </w:r>
           </w:p>
         </w:tc>
@@ -1525,7 +1038,13 @@
           </w:tcPr>
           <w:p>
             <w:r>
-              <w:t>Memperbaiki layout acak menjadi terstruktur dengan prinsip kontras &amp; hierarki.</w:t>
+              <w:t>Instruktur mendemonstrasikan kepada peserta terkait:</w:t>
+              <w:br/>
+              <w:t>- Perbaikan layout awal yang acak-acakan menjadi karya desain yang berhierarki jelas dan seimbang</w:t>
+              <w:br/>
+              <w:t>- Penataan jarak (white space) agar karya tidak terasa sesak</w:t>
+              <w:br/>
+              <w:t>- Tanya jawab interaktif bersama peserta.</w:t>
             </w:r>
           </w:p>
         </w:tc>
@@ -1535,23 +1054,9 @@
             <w:gridSpan w:val="3"/>
           </w:tcPr>
           <w:p>
-            <w:pPr>
-              <w:pBdr>
-                <w:top w:val="nil"/>
-                <w:left w:val="nil"/>
-                <w:bottom w:val="nil"/>
-                <w:right w:val="nil"/>
-                <w:between w:val="nil"/>
-              </w:pBdr>
-              <w:spacing w:before="60" w:line="276" w:lineRule="auto"/>
-              <w:ind w:left="253" w:right="89"/>
-              <w:rPr>
-                <w:rFonts w:ascii="Tahoma" w:eastAsia="Tahoma" w:hAnsi="Tahoma" w:cs="Tahoma"/>
-                <w:color w:val="000000"/>
-                <w:sz w:val="22"/>
-                <w:szCs w:val="22"/>
-              </w:rPr>
-            </w:pPr>
+            <w:r>
+              <w:t>Software Grafis &amp; Screen Projector</w:t>
+            </w:r>
           </w:p>
         </w:tc>
         <w:tc>
@@ -1559,15 +1064,9 @@
             <w:tcW w:w="1850" w:type="dxa"/>
           </w:tcPr>
           <w:p>
-            <w:pPr>
-              <w:spacing w:before="60"/>
-              <w:jc w:val="center"/>
-              <w:rPr>
-                <w:rFonts w:ascii="Tahoma" w:eastAsia="Tahoma" w:hAnsi="Tahoma" w:cs="Tahoma"/>
-                <w:sz w:val="22"/>
-                <w:szCs w:val="22"/>
-              </w:rPr>
-            </w:pPr>
+            <w:r>
+              <w:t>35 menit</w:t>
+            </w:r>
           </w:p>
         </w:tc>
       </w:tr>
@@ -1584,7 +1083,7 @@
           </w:tcPr>
           <w:p>
             <w:r>
-              <w:t>Praktik Menyusun Komposisi</w:t>
+              <w:t>Praktik Mandiri: Menyusun Elemen Layout Poster</w:t>
             </w:r>
           </w:p>
         </w:tc>
@@ -1595,7 +1094,13 @@
           </w:tcPr>
           <w:p>
             <w:r>
-              <w:t>Peserta menyusun elemen teks &amp; gambar menjadi poster yang seimbang.</w:t>
+              <w:t>Instruktur memberikan jobsheet dan mendampingi peserta untuk:</w:t>
+              <w:br/>
+              <w:t>- Menyusun susunan gambar dan teks acak yang disediakan menjadi 1 komposisi poster A4 yang seimbang</w:t>
+              <w:br/>
+              <w:t>- Menerapkan fokal poin pada headline poster</w:t>
+              <w:br/>
+              <w:t>- Instruktur berkeliling memberikan bimbingan dan umpan balik personal kepada setiap peserta.</w:t>
             </w:r>
           </w:p>
         </w:tc>
@@ -1605,23 +1110,9 @@
             <w:gridSpan w:val="3"/>
           </w:tcPr>
           <w:p>
-            <w:pPr>
-              <w:pBdr>
-                <w:top w:val="nil"/>
-                <w:left w:val="nil"/>
-                <w:bottom w:val="nil"/>
-                <w:right w:val="nil"/>
-                <w:between w:val="nil"/>
-              </w:pBdr>
-              <w:spacing w:before="60" w:line="276" w:lineRule="auto"/>
-              <w:ind w:left="253" w:right="89"/>
-              <w:rPr>
-                <w:rFonts w:ascii="Tahoma" w:eastAsia="Tahoma" w:hAnsi="Tahoma" w:cs="Tahoma"/>
-                <w:color w:val="000000"/>
-                <w:sz w:val="22"/>
-                <w:szCs w:val="22"/>
-              </w:rPr>
-            </w:pPr>
+            <w:r>
+              <w:t>PC Lab &amp; Lembar Jobsheet 02</w:t>
+            </w:r>
           </w:p>
         </w:tc>
         <w:tc>
@@ -1629,15 +1120,9 @@
             <w:tcW w:w="1850" w:type="dxa"/>
           </w:tcPr>
           <w:p>
-            <w:pPr>
-              <w:spacing w:before="60"/>
-              <w:jc w:val="center"/>
-              <w:rPr>
-                <w:rFonts w:ascii="Tahoma" w:eastAsia="Tahoma" w:hAnsi="Tahoma" w:cs="Tahoma"/>
-                <w:sz w:val="22"/>
-                <w:szCs w:val="22"/>
-              </w:rPr>
-            </w:pPr>
+            <w:r>
+              <w:t>35 menit</w:t>
+            </w:r>
           </w:p>
         </w:tc>
       </w:tr>
@@ -1653,24 +1138,7 @@
             <w:gridSpan w:val="3"/>
           </w:tcPr>
           <w:p>
-            <w:pPr>
-              <w:pStyle w:val="ListParagraph"/>
-              <w:numPr>
-                <w:ilvl w:val="3"/>
-                <w:numId w:val="5"/>
-              </w:numPr>
-              <w:spacing w:before="60"/>
-              <w:ind w:left="292"/>
-              <w:rPr>
-                <w:rFonts w:ascii="Tahoma" w:eastAsia="Tahoma" w:hAnsi="Tahoma" w:cs="Tahoma"/>
-                <w:b/>
-              </w:rPr>
-            </w:pPr>
-            <w:r>
-              <w:rPr>
-                <w:rFonts w:ascii="Tahoma" w:eastAsia="Tahoma" w:hAnsi="Tahoma" w:cs="Tahoma"/>
-                <w:b/>
-              </w:rPr>
+            <w:r>
               <w:t>Kesimpulan ( Summary)</w:t>
             </w:r>
           </w:p>
@@ -1682,7 +1150,7 @@
           </w:tcPr>
           <w:p>
             <w:r>
-              <w:t>Komposisi yang baik memudahkan penyampaian pesan.</w:t>
+              <w:t>Instruktur menyimpulkan bahwa komposisi yang baik membuat pesan dalam karya desain dapat tersampaikan dengan cepat, jelas, dan nyaman dibaca.</w:t>
             </w:r>
           </w:p>
         </w:tc>
@@ -1692,23 +1160,9 @@
             <w:gridSpan w:val="3"/>
           </w:tcPr>
           <w:p>
-            <w:pPr>
-              <w:pBdr>
-                <w:top w:val="nil"/>
-                <w:left w:val="nil"/>
-                <w:bottom w:val="nil"/>
-                <w:right w:val="nil"/>
-                <w:between w:val="nil"/>
-              </w:pBdr>
-              <w:spacing w:before="60" w:line="276" w:lineRule="auto"/>
-              <w:ind w:left="253" w:right="89"/>
-              <w:rPr>
-                <w:rFonts w:ascii="Tahoma" w:eastAsia="Tahoma" w:hAnsi="Tahoma" w:cs="Tahoma"/>
-                <w:color w:val="000000"/>
-                <w:sz w:val="22"/>
-                <w:szCs w:val="22"/>
-              </w:rPr>
-            </w:pPr>
+            <w:r>
+              <w:t>Power Point</w:t>
+            </w:r>
           </w:p>
         </w:tc>
         <w:tc>
@@ -1716,15 +1170,9 @@
             <w:tcW w:w="1850" w:type="dxa"/>
           </w:tcPr>
           <w:p>
-            <w:pPr>
-              <w:spacing w:before="60"/>
-              <w:jc w:val="center"/>
-              <w:rPr>
-                <w:rFonts w:ascii="Tahoma" w:eastAsia="Tahoma" w:hAnsi="Tahoma" w:cs="Tahoma"/>
-                <w:sz w:val="22"/>
-                <w:szCs w:val="22"/>
-              </w:rPr>
-            </w:pPr>
+            <w:r>
+              <w:t>5 menit</w:t>
+            </w:r>
           </w:p>
         </w:tc>
       </w:tr>
@@ -1741,25 +1189,7 @@
             <w:vAlign w:val="center"/>
           </w:tcPr>
           <w:p>
-            <w:pPr>
-              <w:pStyle w:val="ListParagraph"/>
-              <w:numPr>
-                <w:ilvl w:val="0"/>
-                <w:numId w:val="6"/>
-              </w:numPr>
-              <w:spacing w:before="120" w:after="120"/>
-              <w:ind w:left="436" w:hanging="426"/>
-              <w:jc w:val="both"/>
-              <w:rPr>
-                <w:rFonts w:ascii="Tahoma" w:eastAsia="Tahoma" w:hAnsi="Tahoma" w:cs="Tahoma"/>
-                <w:b/>
-              </w:rPr>
-            </w:pPr>
-            <w:r>
-              <w:rPr>
-                <w:rFonts w:ascii="Tahoma" w:eastAsia="Tahoma" w:hAnsi="Tahoma" w:cs="Tahoma"/>
-                <w:b/>
-              </w:rPr>
+            <w:r>
               <w:t>Aplikasi</w:t>
             </w:r>
           </w:p>
@@ -1771,7 +1201,161 @@
           </w:tcPr>
           <w:p>
             <w:r>
-              <w:t>Kuis identifikasi kesalahan tata letak.</w:t>
+              <w:t>Instruktur memberikan pertanyaan kuis interaktif mengenai identifikasi kesalahan prinsip komposisi visual.</w:t>
+            </w:r>
+          </w:p>
+        </w:tc>
+        <w:tc>
+          <w:tcPr>
+            <w:tcW w:w="1796" w:type="dxa"/>
+            <w:gridSpan w:val="3"/>
+          </w:tcPr>
+          <w:p>
+            <w:r>
+              <w:t>Quizizz.com / Form</w:t>
+            </w:r>
+          </w:p>
+        </w:tc>
+        <w:tc>
+          <w:tcPr>
+            <w:tcW w:w="1850" w:type="dxa"/>
+          </w:tcPr>
+          <w:p>
+            <w:r>
+              <w:t>20 menit</w:t>
+            </w:r>
+          </w:p>
+        </w:tc>
+      </w:tr>
+      <w:tr>
+        <w:trPr>
+          <w:gridAfter w:val="1"/>
+          <w:wAfter w:w="10" w:type="dxa"/>
+          <w:trHeight w:val="306"/>
+        </w:trPr>
+        <w:tc>
+          <w:tcPr>
+            <w:tcW w:w="2665" w:type="dxa"/>
+            <w:gridSpan w:val="3"/>
+            <w:vAlign w:val="center"/>
+          </w:tcPr>
+          <w:p>
+            <w:r>
+              <w:t>Evaluasi</w:t>
+            </w:r>
+          </w:p>
+        </w:tc>
+        <w:tc>
+          <w:tcPr>
+            <w:tcW w:w="3543" w:type="dxa"/>
+            <w:gridSpan w:val="2"/>
+          </w:tcPr>
+          <w:p>
+            <w:r>
+              <w:t>Instruktur menilai hasil karya latihan komposisi visual peserta berdasarkan rubrik penilaian Jobsheet 02.</w:t>
+            </w:r>
+          </w:p>
+        </w:tc>
+        <w:tc>
+          <w:tcPr>
+            <w:tcW w:w="1796" w:type="dxa"/>
+            <w:gridSpan w:val="3"/>
+          </w:tcPr>
+          <w:p>
+            <w:r>
+              <w:t>Lembar Jobsheet 02 &amp; Rubrik</w:t>
+            </w:r>
+          </w:p>
+        </w:tc>
+        <w:tc>
+          <w:tcPr>
+            <w:tcW w:w="1850" w:type="dxa"/>
+          </w:tcPr>
+          <w:p>
+            <w:r>
+              <w:t>30 menit</w:t>
+            </w:r>
+          </w:p>
+        </w:tc>
+      </w:tr>
+      <w:tr>
+        <w:trPr>
+          <w:gridAfter w:val="1"/>
+          <w:wAfter w:w="10" w:type="dxa"/>
+          <w:trHeight w:val="587"/>
+        </w:trPr>
+        <w:tc>
+          <w:tcPr>
+            <w:tcW w:w="2665" w:type="dxa"/>
+            <w:gridSpan w:val="3"/>
+            <w:vAlign w:val="center"/>
+          </w:tcPr>
+          <w:p>
+            <w:r>
+              <w:t>Tugas Tambahan</w:t>
+            </w:r>
+          </w:p>
+        </w:tc>
+        <w:tc>
+          <w:tcPr>
+            <w:tcW w:w="3543" w:type="dxa"/>
+            <w:gridSpan w:val="2"/>
+          </w:tcPr>
+          <w:p>
+            <w:r>
+              <w:t>Instruktur memberikan tugas tambahan: Mencari 1 contoh poster komersial dan menandai bagian mana yang menjadi Focal Point utamanya.</w:t>
+            </w:r>
+          </w:p>
+        </w:tc>
+        <w:tc>
+          <w:tcPr>
+            <w:tcW w:w="1796" w:type="dxa"/>
+            <w:gridSpan w:val="3"/>
+          </w:tcPr>
+          <w:p>
+            <w:r>
+              <w:t>Instruktur memberikan tugas tambahan: Mencari 1 contoh poster komersial dan menandai bagian mana yang menjadi Focal Point utamanya.</w:t>
+            </w:r>
+          </w:p>
+        </w:tc>
+        <w:tc>
+          <w:tcPr>
+            <w:tcW w:w="1850" w:type="dxa"/>
+          </w:tcPr>
+          <w:p>
+            <w:r>
+              <w:t>5 menit</w:t>
+            </w:r>
+          </w:p>
+        </w:tc>
+      </w:tr>
+      <w:tr>
+        <w:trPr>
+          <w:gridAfter w:val="1"/>
+          <w:wAfter w:w="10" w:type="dxa"/>
+        </w:trPr>
+        <w:tc>
+          <w:tcPr>
+            <w:tcW w:w="2665" w:type="dxa"/>
+            <w:gridSpan w:val="3"/>
+            <w:vAlign w:val="center"/>
+          </w:tcPr>
+          <w:p>
+            <w:r>
+              <w:t>Pemberesan Kelas</w:t>
+            </w:r>
+          </w:p>
+        </w:tc>
+        <w:tc>
+          <w:tcPr>
+            <w:tcW w:w="3543" w:type="dxa"/>
+            <w:gridSpan w:val="2"/>
+          </w:tcPr>
+          <w:p>
+            <w:r>
+              <w:t>Merapikan perangkat PC dan ruang lab (5R)</w:t>
+              <w:br/>
+              <w:t>Berdoa dan memberikan salam penutup</w:t>
             </w:r>
           </w:p>
         </w:tc>
@@ -1809,349 +1393,9 @@
             <w:tcW w:w="1850" w:type="dxa"/>
           </w:tcPr>
           <w:p>
-            <w:pPr>
-              <w:pBdr>
-                <w:top w:val="nil"/>
-                <w:left w:val="nil"/>
-                <w:bottom w:val="nil"/>
-                <w:right w:val="nil"/>
-                <w:between w:val="nil"/>
-              </w:pBdr>
-              <w:spacing w:before="60"/>
-              <w:jc w:val="center"/>
-              <w:rPr>
-                <w:rFonts w:ascii="Tahoma" w:eastAsia="Tahoma" w:hAnsi="Tahoma" w:cs="Tahoma"/>
-                <w:sz w:val="22"/>
-                <w:szCs w:val="22"/>
-              </w:rPr>
-            </w:pPr>
-          </w:p>
-        </w:tc>
-      </w:tr>
-      <w:tr>
-        <w:trPr>
-          <w:gridAfter w:val="1"/>
-          <w:wAfter w:w="10" w:type="dxa"/>
-          <w:trHeight w:val="306"/>
-        </w:trPr>
-        <w:tc>
-          <w:tcPr>
-            <w:tcW w:w="2665" w:type="dxa"/>
-            <w:gridSpan w:val="3"/>
-            <w:vAlign w:val="center"/>
-          </w:tcPr>
-          <w:p>
-            <w:pPr>
-              <w:pStyle w:val="ListParagraph"/>
-              <w:numPr>
-                <w:ilvl w:val="0"/>
-                <w:numId w:val="6"/>
-              </w:numPr>
-              <w:spacing w:before="120" w:after="120"/>
-              <w:ind w:left="436" w:hanging="426"/>
-              <w:jc w:val="both"/>
-              <w:rPr>
-                <w:rFonts w:ascii="Tahoma" w:eastAsia="Tahoma" w:hAnsi="Tahoma" w:cs="Tahoma"/>
-                <w:b/>
-              </w:rPr>
-            </w:pPr>
-            <w:r>
-              <w:rPr>
-                <w:rFonts w:ascii="Tahoma" w:eastAsia="Tahoma" w:hAnsi="Tahoma" w:cs="Tahoma"/>
-                <w:b/>
-              </w:rPr>
-              <w:t>Evaluasi</w:t>
-            </w:r>
-          </w:p>
-        </w:tc>
-        <w:tc>
-          <w:tcPr>
-            <w:tcW w:w="3543" w:type="dxa"/>
-            <w:gridSpan w:val="2"/>
-          </w:tcPr>
-          <w:p>
-            <w:r>
-              <w:t>Jobsheet 02: Latihan Komposisi.</w:t>
-            </w:r>
-          </w:p>
-        </w:tc>
-        <w:tc>
-          <w:tcPr>
-            <w:tcW w:w="1796" w:type="dxa"/>
-            <w:gridSpan w:val="3"/>
-          </w:tcPr>
-          <w:p>
-            <w:pPr>
-              <w:numPr>
-                <w:ilvl w:val="0"/>
-                <w:numId w:val="4"/>
-              </w:numPr>
-              <w:pBdr>
-                <w:top w:val="nil"/>
-                <w:left w:val="nil"/>
-                <w:bottom w:val="nil"/>
-                <w:right w:val="nil"/>
-                <w:between w:val="nil"/>
-              </w:pBdr>
-              <w:spacing w:before="60" w:line="276" w:lineRule="auto"/>
-              <w:ind w:left="253" w:right="89" w:hanging="220"/>
-              <w:rPr>
-                <w:rFonts w:ascii="Tahoma" w:eastAsia="Tahoma" w:hAnsi="Tahoma" w:cs="Tahoma"/>
-                <w:color w:val="000000"/>
-                <w:sz w:val="22"/>
-                <w:szCs w:val="22"/>
-              </w:rPr>
-            </w:pPr>
-          </w:p>
-        </w:tc>
-        <w:tc>
-          <w:tcPr>
-            <w:tcW w:w="1850" w:type="dxa"/>
-          </w:tcPr>
-          <w:p>
-            <w:pPr>
-              <w:pBdr>
-                <w:top w:val="nil"/>
-                <w:left w:val="nil"/>
-                <w:bottom w:val="nil"/>
-                <w:right w:val="nil"/>
-                <w:between w:val="nil"/>
-              </w:pBdr>
-              <w:spacing w:before="60"/>
-              <w:jc w:val="center"/>
-              <w:rPr>
-                <w:rFonts w:ascii="Tahoma" w:eastAsia="Tahoma" w:hAnsi="Tahoma" w:cs="Tahoma"/>
-                <w:sz w:val="22"/>
-                <w:szCs w:val="22"/>
-              </w:rPr>
-            </w:pPr>
-          </w:p>
-        </w:tc>
-      </w:tr>
-      <w:tr>
-        <w:trPr>
-          <w:gridAfter w:val="1"/>
-          <w:wAfter w:w="10" w:type="dxa"/>
-          <w:trHeight w:val="587"/>
-        </w:trPr>
-        <w:tc>
-          <w:tcPr>
-            <w:tcW w:w="2665" w:type="dxa"/>
-            <w:gridSpan w:val="3"/>
-            <w:vAlign w:val="center"/>
-          </w:tcPr>
-          <w:p>
-            <w:pPr>
-              <w:spacing w:before="120" w:after="120"/>
-              <w:jc w:val="both"/>
-              <w:rPr>
-                <w:rFonts w:ascii="Tahoma" w:eastAsia="Tahoma" w:hAnsi="Tahoma" w:cs="Tahoma"/>
-                <w:b/>
-                <w:sz w:val="22"/>
-                <w:szCs w:val="22"/>
-              </w:rPr>
-            </w:pPr>
-            <w:r>
-              <w:rPr>
-                <w:rFonts w:ascii="Tahoma" w:eastAsia="Tahoma" w:hAnsi="Tahoma" w:cs="Tahoma"/>
-                <w:b/>
-                <w:sz w:val="22"/>
-                <w:szCs w:val="22"/>
-              </w:rPr>
-              <w:t>Tugas Tambahan</w:t>
-            </w:r>
-          </w:p>
-        </w:tc>
-        <w:tc>
-          <w:tcPr>
-            <w:tcW w:w="3543" w:type="dxa"/>
-            <w:gridSpan w:val="2"/>
-          </w:tcPr>
-          <w:p>
-            <w:pPr>
-              <w:numPr>
-                <w:ilvl w:val="0"/>
-                <w:numId w:val="4"/>
-              </w:numPr>
-              <w:pBdr>
-                <w:top w:val="nil"/>
-                <w:left w:val="nil"/>
-                <w:bottom w:val="nil"/>
-                <w:right w:val="nil"/>
-                <w:between w:val="nil"/>
-              </w:pBdr>
-              <w:spacing w:before="60" w:line="276" w:lineRule="auto"/>
-              <w:ind w:left="253" w:right="89" w:hanging="220"/>
-              <w:rPr>
-                <w:rFonts w:ascii="Tahoma" w:eastAsia="Tahoma" w:hAnsi="Tahoma" w:cs="Tahoma"/>
-                <w:color w:val="000000"/>
-                <w:sz w:val="22"/>
-                <w:szCs w:val="22"/>
-              </w:rPr>
-            </w:pPr>
-          </w:p>
-        </w:tc>
-        <w:tc>
-          <w:tcPr>
-            <w:tcW w:w="1796" w:type="dxa"/>
-            <w:gridSpan w:val="3"/>
-          </w:tcPr>
-          <w:p>
-            <w:pPr>
-              <w:pBdr>
-                <w:top w:val="nil"/>
-                <w:left w:val="nil"/>
-                <w:bottom w:val="nil"/>
-                <w:right w:val="nil"/>
-                <w:between w:val="nil"/>
-              </w:pBdr>
-              <w:spacing w:before="60" w:line="276" w:lineRule="auto"/>
-              <w:ind w:left="33" w:right="89"/>
-              <w:rPr>
-                <w:rFonts w:ascii="Tahoma" w:eastAsia="Tahoma" w:hAnsi="Tahoma" w:cs="Tahoma"/>
-                <w:color w:val="000000"/>
-                <w:sz w:val="22"/>
-                <w:szCs w:val="22"/>
-              </w:rPr>
-            </w:pPr>
-          </w:p>
-        </w:tc>
-        <w:tc>
-          <w:tcPr>
-            <w:tcW w:w="1850" w:type="dxa"/>
-          </w:tcPr>
-          <w:p>
-            <w:pPr>
-              <w:pBdr>
-                <w:top w:val="nil"/>
-                <w:left w:val="nil"/>
-                <w:bottom w:val="nil"/>
-                <w:right w:val="nil"/>
-                <w:between w:val="nil"/>
-              </w:pBdr>
-              <w:spacing w:before="60"/>
-              <w:jc w:val="center"/>
-              <w:rPr>
-                <w:rFonts w:ascii="Tahoma" w:eastAsia="Tahoma" w:hAnsi="Tahoma" w:cs="Tahoma"/>
-                <w:sz w:val="22"/>
-                <w:szCs w:val="22"/>
-              </w:rPr>
-            </w:pPr>
-          </w:p>
-        </w:tc>
-      </w:tr>
-      <w:tr>
-        <w:trPr>
-          <w:gridAfter w:val="1"/>
-          <w:wAfter w:w="10" w:type="dxa"/>
-        </w:trPr>
-        <w:tc>
-          <w:tcPr>
-            <w:tcW w:w="2665" w:type="dxa"/>
-            <w:gridSpan w:val="3"/>
-            <w:vAlign w:val="center"/>
-          </w:tcPr>
-          <w:p>
-            <w:pPr>
-              <w:spacing w:before="120" w:after="120"/>
-              <w:jc w:val="both"/>
-              <w:rPr>
-                <w:rFonts w:ascii="Tahoma" w:eastAsia="Tahoma" w:hAnsi="Tahoma" w:cs="Tahoma"/>
-                <w:b/>
-                <w:sz w:val="22"/>
-                <w:szCs w:val="22"/>
-              </w:rPr>
-            </w:pPr>
-            <w:r>
-              <w:rPr>
-                <w:rFonts w:ascii="Tahoma" w:eastAsia="Tahoma" w:hAnsi="Tahoma" w:cs="Tahoma"/>
-                <w:b/>
-                <w:sz w:val="22"/>
-                <w:szCs w:val="22"/>
-              </w:rPr>
-              <w:t>Pemberesan Kelas</w:t>
-            </w:r>
-          </w:p>
-        </w:tc>
-        <w:tc>
-          <w:tcPr>
-            <w:tcW w:w="3543" w:type="dxa"/>
-            <w:gridSpan w:val="2"/>
-          </w:tcPr>
-          <w:p>
-            <w:pPr>
-              <w:numPr>
-                <w:ilvl w:val="0"/>
-                <w:numId w:val="4"/>
-              </w:numPr>
-              <w:pBdr>
-                <w:top w:val="nil"/>
-                <w:left w:val="nil"/>
-                <w:bottom w:val="nil"/>
-                <w:right w:val="nil"/>
-                <w:between w:val="nil"/>
-              </w:pBdr>
-              <w:spacing w:before="60" w:line="276" w:lineRule="auto"/>
-              <w:ind w:left="253" w:right="89" w:hanging="220"/>
-              <w:rPr>
-                <w:rFonts w:ascii="Tahoma" w:eastAsia="Tahoma" w:hAnsi="Tahoma" w:cs="Tahoma"/>
-                <w:color w:val="000000"/>
-                <w:sz w:val="22"/>
-                <w:szCs w:val="22"/>
-              </w:rPr>
-            </w:pPr>
-          </w:p>
-        </w:tc>
-        <w:tc>
-          <w:tcPr>
-            <w:tcW w:w="1796" w:type="dxa"/>
-            <w:gridSpan w:val="3"/>
-          </w:tcPr>
-          <w:p>
-            <w:pPr>
-              <w:numPr>
-                <w:ilvl w:val="0"/>
-                <w:numId w:val="4"/>
-              </w:numPr>
-              <w:pBdr>
-                <w:top w:val="nil"/>
-                <w:left w:val="nil"/>
-                <w:bottom w:val="nil"/>
-                <w:right w:val="nil"/>
-                <w:between w:val="nil"/>
-              </w:pBdr>
-              <w:spacing w:before="60" w:line="276" w:lineRule="auto"/>
-              <w:ind w:left="253" w:right="89" w:hanging="220"/>
-              <w:rPr>
-                <w:rFonts w:ascii="Tahoma" w:eastAsia="Tahoma" w:hAnsi="Tahoma" w:cs="Tahoma"/>
-                <w:color w:val="000000"/>
-                <w:sz w:val="22"/>
-                <w:szCs w:val="22"/>
-              </w:rPr>
-            </w:pPr>
-          </w:p>
-        </w:tc>
-        <w:tc>
-          <w:tcPr>
-            <w:tcW w:w="1850" w:type="dxa"/>
-          </w:tcPr>
-          <w:p>
-            <w:pPr>
-              <w:pBdr>
-                <w:top w:val="nil"/>
-                <w:left w:val="nil"/>
-                <w:bottom w:val="nil"/>
-                <w:right w:val="nil"/>
-                <w:between w:val="nil"/>
-              </w:pBdr>
-              <w:spacing w:before="60"/>
-              <w:jc w:val="center"/>
-              <w:rPr>
-                <w:rFonts w:ascii="Tahoma" w:eastAsia="Tahoma" w:hAnsi="Tahoma" w:cs="Tahoma"/>
-                <w:sz w:val="22"/>
-                <w:szCs w:val="22"/>
-              </w:rPr>
-            </w:pPr>
+            <w:r>
+              <w:t>5 menit</w:t>
+            </w:r>
           </w:p>
         </w:tc>
       </w:tr>

</xml_diff>